<commit_message>
Actualiza generador y excluye archivos generados
Co-authored-by: Copilot <223556219+Copilot@users.noreply.github.com>
</commit_message>
<xml_diff>
--- a/06_ACTA_DE_IDENTIFICACION_PLANTILLA.docx
+++ b/06_ACTA_DE_IDENTIFICACION_PLANTILLA.docx
@@ -19,27 +19,7 @@
           <w:sz w:val="24"/>
           <w:lang w:val="es-SV"/>
         </w:rPr>
-        <w:t>PNC.SO.112.3.4/n1-{{</w:t>
-      </w:r>
-      <w:proofErr w:type="spellStart"/>
-      <w:r>
-        <w:rPr>
-          <w:rFonts w:ascii="Arial" w:hAnsi="Arial"/>
-          <w:b/>
-          <w:sz w:val="24"/>
-          <w:lang w:val="es-SV"/>
-        </w:rPr>
-        <w:t>codigo_expediente</w:t>
-      </w:r>
-      <w:proofErr w:type="spellEnd"/>
-      <w:r>
-        <w:rPr>
-          <w:rFonts w:ascii="Arial" w:hAnsi="Arial"/>
-          <w:b/>
-          <w:sz w:val="24"/>
-          <w:lang w:val="es-SV"/>
-        </w:rPr>
-        <w:t>}}</w:t>
+        <w:t>PNC.SO.112.3.4/n1-{{codigo_expediente}}</w:t>
       </w:r>
     </w:p>
     <w:p>
@@ -212,27 +192,7 @@
           <w:sz w:val="24"/>
           <w:lang w:val="es-SV"/>
         </w:rPr>
-        <w:t xml:space="preserve">Quien en este acto procede a identificar y leer sus derechos {{ </w:t>
-      </w:r>
-      <w:proofErr w:type="spellStart"/>
-      <w:r>
-        <w:rPr>
-          <w:rFonts w:ascii="Arial" w:hAnsi="Arial"/>
-          <w:b/>
-          <w:sz w:val="24"/>
-          <w:lang w:val="es-SV"/>
-        </w:rPr>
-        <w:t>a_los_imputados_identificacion</w:t>
-      </w:r>
-      <w:proofErr w:type="spellEnd"/>
-      <w:r>
-        <w:rPr>
-          <w:rFonts w:ascii="Arial" w:hAnsi="Arial"/>
-          <w:b/>
-          <w:sz w:val="24"/>
-          <w:lang w:val="es-SV"/>
-        </w:rPr>
-        <w:t xml:space="preserve"> }}:</w:t>
+        <w:t>Quien en este acto procede a identificar y leer sus derechos {{ a_los_imputados_identificacion }}:</w:t>
       </w:r>
       <w:r>
         <w:rPr>
@@ -250,27 +210,7 @@
           <w:sz w:val="24"/>
           <w:lang w:val="es-SV"/>
         </w:rPr>
-        <w:t xml:space="preserve">{{ </w:t>
-      </w:r>
-      <w:proofErr w:type="spellStart"/>
-      <w:r>
-        <w:rPr>
-          <w:rFonts w:ascii="Arial" w:hAnsi="Arial"/>
-          <w:b/>
-          <w:sz w:val="24"/>
-          <w:lang w:val="es-SV"/>
-        </w:rPr>
-        <w:t>bloque_datos_identificacion</w:t>
-      </w:r>
-      <w:proofErr w:type="spellEnd"/>
-      <w:r>
-        <w:rPr>
-          <w:rFonts w:ascii="Arial" w:hAnsi="Arial"/>
-          <w:b/>
-          <w:sz w:val="24"/>
-          <w:lang w:val="es-SV"/>
-        </w:rPr>
-        <w:t xml:space="preserve"> }}</w:t>
+        <w:t>{{ bloque_datos_identificacion }}</w:t>
       </w:r>
       <w:r>
         <w:rPr>
@@ -288,518 +228,7 @@
           <w:sz w:val="24"/>
           <w:lang w:val="es-SV"/>
         </w:rPr>
-        <w:t xml:space="preserve">A {{ </w:t>
-      </w:r>
-      <w:proofErr w:type="spellStart"/>
-      <w:r>
-        <w:rPr>
-          <w:rFonts w:ascii="Arial" w:hAnsi="Arial"/>
-          <w:b/>
-          <w:sz w:val="24"/>
-          <w:lang w:val="es-SV"/>
-        </w:rPr>
-        <w:t>quienes_identificacion</w:t>
-      </w:r>
-      <w:proofErr w:type="spellEnd"/>
-      <w:r>
-        <w:rPr>
-          <w:rFonts w:ascii="Arial" w:hAnsi="Arial"/>
-          <w:b/>
-          <w:sz w:val="24"/>
-          <w:lang w:val="es-SV"/>
-        </w:rPr>
-        <w:t xml:space="preserve"> }} de conformidad a los Artículos 13 Cn, 19,10,82, 241 numeral 9, C. </w:t>
-      </w:r>
-      <w:proofErr w:type="spellStart"/>
-      <w:r>
-        <w:rPr>
-          <w:rFonts w:ascii="Arial" w:hAnsi="Arial"/>
-          <w:b/>
-          <w:sz w:val="24"/>
-          <w:lang w:val="es-SV"/>
-        </w:rPr>
-        <w:t>Pr.Pn</w:t>
-      </w:r>
-      <w:proofErr w:type="spellEnd"/>
-      <w:r>
-        <w:rPr>
-          <w:rFonts w:ascii="Arial" w:hAnsi="Arial"/>
-          <w:b/>
-          <w:sz w:val="24"/>
-          <w:lang w:val="es-SV"/>
-        </w:rPr>
-        <w:t xml:space="preserve">. se </w:t>
-      </w:r>
-      <w:proofErr w:type="gramStart"/>
-      <w:r>
-        <w:rPr>
-          <w:rFonts w:ascii="Arial" w:hAnsi="Arial"/>
-          <w:b/>
-          <w:sz w:val="24"/>
-          <w:lang w:val="es-SV"/>
-        </w:rPr>
-        <w:t xml:space="preserve">{{ </w:t>
-      </w:r>
-      <w:proofErr w:type="spellStart"/>
-      <w:r>
-        <w:rPr>
-          <w:rFonts w:ascii="Arial" w:hAnsi="Arial"/>
-          <w:b/>
-          <w:sz w:val="24"/>
-          <w:lang w:val="es-SV"/>
-        </w:rPr>
-        <w:t>plural</w:t>
-      </w:r>
-      <w:proofErr w:type="gramEnd"/>
-      <w:r>
-        <w:rPr>
-          <w:rFonts w:ascii="Arial" w:hAnsi="Arial"/>
-          <w:b/>
-          <w:sz w:val="24"/>
-          <w:lang w:val="es-SV"/>
-        </w:rPr>
-        <w:t>_</w:t>
-      </w:r>
-      <w:proofErr w:type="gramStart"/>
-      <w:r>
-        <w:rPr>
-          <w:rFonts w:ascii="Arial" w:hAnsi="Arial"/>
-          <w:b/>
-          <w:sz w:val="24"/>
-          <w:lang w:val="es-SV"/>
-        </w:rPr>
-        <w:t>les</w:t>
-      </w:r>
-      <w:proofErr w:type="spellEnd"/>
-      <w:r>
-        <w:rPr>
-          <w:rFonts w:ascii="Arial" w:hAnsi="Arial"/>
-          <w:b/>
-          <w:sz w:val="24"/>
-          <w:lang w:val="es-SV"/>
-        </w:rPr>
-        <w:t xml:space="preserve"> }</w:t>
-      </w:r>
-      <w:proofErr w:type="gramEnd"/>
-      <w:r>
-        <w:rPr>
-          <w:rFonts w:ascii="Arial" w:hAnsi="Arial"/>
-          <w:b/>
-          <w:sz w:val="24"/>
-          <w:lang w:val="es-SV"/>
-        </w:rPr>
-        <w:t xml:space="preserve">} informa de sus derechos en forma comprensible y clara, </w:t>
-      </w:r>
-      <w:proofErr w:type="gramStart"/>
-      <w:r>
-        <w:rPr>
-          <w:rFonts w:ascii="Arial" w:hAnsi="Arial"/>
-          <w:b/>
-          <w:sz w:val="24"/>
-          <w:lang w:val="es-SV"/>
-        </w:rPr>
-        <w:t xml:space="preserve">leyéndosele{{ </w:t>
-      </w:r>
-      <w:proofErr w:type="spellStart"/>
-      <w:r>
-        <w:rPr>
-          <w:rFonts w:ascii="Arial" w:hAnsi="Arial"/>
-          <w:b/>
-          <w:sz w:val="24"/>
-          <w:lang w:val="es-SV"/>
-        </w:rPr>
-        <w:t>plural</w:t>
-      </w:r>
-      <w:proofErr w:type="gramEnd"/>
-      <w:r>
-        <w:rPr>
-          <w:rFonts w:ascii="Arial" w:hAnsi="Arial"/>
-          <w:b/>
-          <w:sz w:val="24"/>
-          <w:lang w:val="es-SV"/>
-        </w:rPr>
-        <w:t>_</w:t>
-      </w:r>
-      <w:proofErr w:type="gramStart"/>
-      <w:r>
-        <w:rPr>
-          <w:rFonts w:ascii="Arial" w:hAnsi="Arial"/>
-          <w:b/>
-          <w:sz w:val="24"/>
-          <w:lang w:val="es-SV"/>
-        </w:rPr>
-        <w:t>s</w:t>
-      </w:r>
-      <w:proofErr w:type="spellEnd"/>
-      <w:r>
-        <w:rPr>
-          <w:rFonts w:ascii="Arial" w:hAnsi="Arial"/>
-          <w:b/>
-          <w:sz w:val="24"/>
-          <w:lang w:val="es-SV"/>
-        </w:rPr>
-        <w:t xml:space="preserve"> }</w:t>
-      </w:r>
-      <w:proofErr w:type="gramEnd"/>
-      <w:r>
-        <w:rPr>
-          <w:rFonts w:ascii="Arial" w:hAnsi="Arial"/>
-          <w:b/>
-          <w:sz w:val="24"/>
-          <w:lang w:val="es-SV"/>
-        </w:rPr>
-        <w:t xml:space="preserve">} los artículos antes citados, </w:t>
-      </w:r>
-      <w:proofErr w:type="gramStart"/>
-      <w:r>
-        <w:rPr>
-          <w:rFonts w:ascii="Arial" w:hAnsi="Arial"/>
-          <w:b/>
-          <w:sz w:val="24"/>
-          <w:lang w:val="es-SV"/>
-        </w:rPr>
-        <w:t xml:space="preserve">explicándole{{ </w:t>
-      </w:r>
-      <w:proofErr w:type="spellStart"/>
-      <w:r>
-        <w:rPr>
-          <w:rFonts w:ascii="Arial" w:hAnsi="Arial"/>
-          <w:b/>
-          <w:sz w:val="24"/>
-          <w:lang w:val="es-SV"/>
-        </w:rPr>
-        <w:t>plural</w:t>
-      </w:r>
-      <w:proofErr w:type="gramEnd"/>
-      <w:r>
-        <w:rPr>
-          <w:rFonts w:ascii="Arial" w:hAnsi="Arial"/>
-          <w:b/>
-          <w:sz w:val="24"/>
-          <w:lang w:val="es-SV"/>
-        </w:rPr>
-        <w:t>_</w:t>
-      </w:r>
-      <w:proofErr w:type="gramStart"/>
-      <w:r>
-        <w:rPr>
-          <w:rFonts w:ascii="Arial" w:hAnsi="Arial"/>
-          <w:b/>
-          <w:sz w:val="24"/>
-          <w:lang w:val="es-SV"/>
-        </w:rPr>
-        <w:t>s</w:t>
-      </w:r>
-      <w:proofErr w:type="spellEnd"/>
-      <w:r>
-        <w:rPr>
-          <w:rFonts w:ascii="Arial" w:hAnsi="Arial"/>
-          <w:b/>
-          <w:sz w:val="24"/>
-          <w:lang w:val="es-SV"/>
-        </w:rPr>
-        <w:t xml:space="preserve"> }</w:t>
-      </w:r>
-      <w:proofErr w:type="gramEnd"/>
-      <w:r>
-        <w:rPr>
-          <w:rFonts w:ascii="Arial" w:hAnsi="Arial"/>
-          <w:b/>
-          <w:sz w:val="24"/>
-          <w:lang w:val="es-SV"/>
-        </w:rPr>
-        <w:t xml:space="preserve">} que </w:t>
-      </w:r>
-      <w:proofErr w:type="gramStart"/>
-      <w:r>
-        <w:rPr>
-          <w:rFonts w:ascii="Arial" w:hAnsi="Arial"/>
-          <w:b/>
-          <w:sz w:val="24"/>
-          <w:lang w:val="es-SV"/>
-        </w:rPr>
-        <w:t xml:space="preserve">{{ </w:t>
-      </w:r>
-      <w:proofErr w:type="spellStart"/>
-      <w:r>
-        <w:rPr>
-          <w:rFonts w:ascii="Arial" w:hAnsi="Arial"/>
-          <w:b/>
-          <w:sz w:val="24"/>
-          <w:lang w:val="es-SV"/>
-        </w:rPr>
-        <w:t>plural</w:t>
-      </w:r>
-      <w:proofErr w:type="gramEnd"/>
-      <w:r>
-        <w:rPr>
-          <w:rFonts w:ascii="Arial" w:hAnsi="Arial"/>
-          <w:b/>
-          <w:sz w:val="24"/>
-          <w:lang w:val="es-SV"/>
-        </w:rPr>
-        <w:t>_</w:t>
-      </w:r>
-      <w:proofErr w:type="gramStart"/>
-      <w:r>
-        <w:rPr>
-          <w:rFonts w:ascii="Arial" w:hAnsi="Arial"/>
-          <w:b/>
-          <w:sz w:val="24"/>
-          <w:lang w:val="es-SV"/>
-        </w:rPr>
-        <w:t>quedan</w:t>
-      </w:r>
-      <w:proofErr w:type="spellEnd"/>
-      <w:r>
-        <w:rPr>
-          <w:rFonts w:ascii="Arial" w:hAnsi="Arial"/>
-          <w:b/>
-          <w:sz w:val="24"/>
-          <w:lang w:val="es-SV"/>
-        </w:rPr>
-        <w:t xml:space="preserve"> }</w:t>
-      </w:r>
-      <w:proofErr w:type="gramEnd"/>
-      <w:r>
-        <w:rPr>
-          <w:rFonts w:ascii="Arial" w:hAnsi="Arial"/>
-          <w:b/>
-          <w:sz w:val="24"/>
-          <w:lang w:val="es-SV"/>
-        </w:rPr>
-        <w:t xml:space="preserve">} </w:t>
-      </w:r>
-      <w:proofErr w:type="spellStart"/>
-      <w:proofErr w:type="gramStart"/>
-      <w:r>
-        <w:rPr>
-          <w:rFonts w:ascii="Arial" w:hAnsi="Arial"/>
-          <w:b/>
-          <w:sz w:val="24"/>
-          <w:lang w:val="es-SV"/>
-        </w:rPr>
-        <w:t>detenid</w:t>
-      </w:r>
-      <w:proofErr w:type="spellEnd"/>
-      <w:r>
-        <w:rPr>
-          <w:rFonts w:ascii="Arial" w:hAnsi="Arial"/>
-          <w:b/>
-          <w:sz w:val="24"/>
-          <w:lang w:val="es-SV"/>
-        </w:rPr>
-        <w:t xml:space="preserve">{{ </w:t>
-      </w:r>
-      <w:proofErr w:type="spellStart"/>
-      <w:r>
-        <w:rPr>
-          <w:rFonts w:ascii="Arial" w:hAnsi="Arial"/>
-          <w:b/>
-          <w:sz w:val="24"/>
-          <w:lang w:val="es-SV"/>
-        </w:rPr>
-        <w:t>plural</w:t>
-      </w:r>
-      <w:proofErr w:type="gramEnd"/>
-      <w:r>
-        <w:rPr>
-          <w:rFonts w:ascii="Arial" w:hAnsi="Arial"/>
-          <w:b/>
-          <w:sz w:val="24"/>
-          <w:lang w:val="es-SV"/>
-        </w:rPr>
-        <w:t>_os_</w:t>
-      </w:r>
-      <w:proofErr w:type="gramStart"/>
-      <w:r>
-        <w:rPr>
-          <w:rFonts w:ascii="Arial" w:hAnsi="Arial"/>
-          <w:b/>
-          <w:sz w:val="24"/>
-          <w:lang w:val="es-SV"/>
-        </w:rPr>
-        <w:t>as</w:t>
-      </w:r>
-      <w:proofErr w:type="spellEnd"/>
-      <w:r>
-        <w:rPr>
-          <w:rFonts w:ascii="Arial" w:hAnsi="Arial"/>
-          <w:b/>
-          <w:sz w:val="24"/>
-          <w:lang w:val="es-SV"/>
-        </w:rPr>
-        <w:t xml:space="preserve"> }</w:t>
-      </w:r>
-      <w:proofErr w:type="gramEnd"/>
-      <w:r>
-        <w:rPr>
-          <w:rFonts w:ascii="Arial" w:hAnsi="Arial"/>
-          <w:b/>
-          <w:sz w:val="24"/>
-          <w:lang w:val="es-SV"/>
-        </w:rPr>
-        <w:t xml:space="preserve">} por orden de la </w:t>
-      </w:r>
-      <w:proofErr w:type="gramStart"/>
-      <w:r>
-        <w:rPr>
-          <w:rFonts w:ascii="Arial" w:hAnsi="Arial"/>
-          <w:b/>
-          <w:sz w:val="24"/>
-          <w:lang w:val="es-SV"/>
-        </w:rPr>
-        <w:t>Fiscalía General</w:t>
-      </w:r>
-      <w:proofErr w:type="gramEnd"/>
-      <w:r>
-        <w:rPr>
-          <w:rFonts w:ascii="Arial" w:hAnsi="Arial"/>
-          <w:b/>
-          <w:sz w:val="24"/>
-          <w:lang w:val="es-SV"/>
-        </w:rPr>
-        <w:t xml:space="preserve"> de la </w:t>
-      </w:r>
-      <w:proofErr w:type="spellStart"/>
-      <w:r>
-        <w:rPr>
-          <w:rFonts w:ascii="Arial" w:hAnsi="Arial"/>
-          <w:b/>
-          <w:sz w:val="24"/>
-          <w:lang w:val="es-SV"/>
-        </w:rPr>
-        <w:t>Republica</w:t>
-      </w:r>
-      <w:proofErr w:type="spellEnd"/>
-      <w:r>
-        <w:rPr>
-          <w:rFonts w:ascii="Arial" w:hAnsi="Arial"/>
-          <w:b/>
-          <w:sz w:val="24"/>
-          <w:lang w:val="es-SV"/>
-        </w:rPr>
-        <w:t xml:space="preserve">, </w:t>
-      </w:r>
-      <w:proofErr w:type="gramStart"/>
-      <w:r>
-        <w:rPr>
-          <w:rFonts w:ascii="Arial" w:hAnsi="Arial"/>
-          <w:b/>
-          <w:sz w:val="24"/>
-          <w:lang w:val="es-SV"/>
-        </w:rPr>
-        <w:t xml:space="preserve">{{ </w:t>
-      </w:r>
-      <w:proofErr w:type="spellStart"/>
-      <w:r>
-        <w:rPr>
-          <w:rFonts w:ascii="Arial" w:hAnsi="Arial"/>
-          <w:b/>
-          <w:sz w:val="24"/>
-          <w:lang w:val="es-SV"/>
-        </w:rPr>
-        <w:t>texto</w:t>
-      </w:r>
-      <w:proofErr w:type="gramEnd"/>
-      <w:r>
-        <w:rPr>
-          <w:rFonts w:ascii="Arial" w:hAnsi="Arial"/>
-          <w:b/>
-          <w:sz w:val="24"/>
-          <w:lang w:val="es-SV"/>
-        </w:rPr>
-        <w:t>_delitos_</w:t>
-      </w:r>
-      <w:proofErr w:type="gramStart"/>
-      <w:r>
-        <w:rPr>
-          <w:rFonts w:ascii="Arial" w:hAnsi="Arial"/>
-          <w:b/>
-          <w:sz w:val="24"/>
-          <w:lang w:val="es-SV"/>
-        </w:rPr>
-        <w:t>identificacion</w:t>
-      </w:r>
-      <w:proofErr w:type="spellEnd"/>
-      <w:r>
-        <w:rPr>
-          <w:rFonts w:ascii="Arial" w:hAnsi="Arial"/>
-          <w:b/>
-          <w:sz w:val="24"/>
-          <w:lang w:val="es-SV"/>
-        </w:rPr>
-        <w:t xml:space="preserve"> }</w:t>
-      </w:r>
-      <w:proofErr w:type="gramEnd"/>
-      <w:r>
-        <w:rPr>
-          <w:rFonts w:ascii="Arial" w:hAnsi="Arial"/>
-          <w:b/>
-          <w:sz w:val="24"/>
-          <w:lang w:val="es-SV"/>
-        </w:rPr>
-        <w:t xml:space="preserve">} en perjuicio de </w:t>
-      </w:r>
-      <w:proofErr w:type="gramStart"/>
-      <w:r>
-        <w:rPr>
-          <w:rFonts w:ascii="Arial" w:hAnsi="Arial"/>
-          <w:b/>
-          <w:sz w:val="24"/>
-          <w:lang w:val="es-SV"/>
-        </w:rPr>
-        <w:t xml:space="preserve">{{ </w:t>
-      </w:r>
-      <w:proofErr w:type="spellStart"/>
-      <w:r>
-        <w:rPr>
-          <w:rFonts w:ascii="Arial" w:hAnsi="Arial"/>
-          <w:b/>
-          <w:sz w:val="24"/>
-          <w:lang w:val="es-SV"/>
-        </w:rPr>
-        <w:t>bloque</w:t>
-      </w:r>
-      <w:proofErr w:type="gramEnd"/>
-      <w:r>
-        <w:rPr>
-          <w:rFonts w:ascii="Arial" w:hAnsi="Arial"/>
-          <w:b/>
-          <w:sz w:val="24"/>
-          <w:lang w:val="es-SV"/>
-        </w:rPr>
-        <w:t>_victimas_</w:t>
-      </w:r>
-      <w:proofErr w:type="gramStart"/>
-      <w:r>
-        <w:rPr>
-          <w:rFonts w:ascii="Arial" w:hAnsi="Arial"/>
-          <w:b/>
-          <w:sz w:val="24"/>
-          <w:lang w:val="es-SV"/>
-        </w:rPr>
-        <w:t>remision</w:t>
-      </w:r>
-      <w:proofErr w:type="spellEnd"/>
-      <w:r>
-        <w:rPr>
-          <w:rFonts w:ascii="Arial" w:hAnsi="Arial"/>
-          <w:b/>
-          <w:sz w:val="24"/>
-          <w:lang w:val="es-SV"/>
-        </w:rPr>
-        <w:t xml:space="preserve"> }</w:t>
-      </w:r>
-      <w:proofErr w:type="gramEnd"/>
-      <w:r>
-        <w:rPr>
-          <w:rFonts w:ascii="Arial" w:hAnsi="Arial"/>
-          <w:b/>
-          <w:sz w:val="24"/>
-          <w:lang w:val="es-SV"/>
-        </w:rPr>
-        <w:t>}.</w:t>
+        <w:t>A {{ quienes_identificacion }} de conformidad a los Artículos 13 Cn, 19,10,82, 241 numeral 9, C. Pr.Pn. se {{ plural_les }} informa de sus derechos en forma comprensible y clara, leyéndosele{{ plural_s }} los artículos antes citados, explicándole{{ plural_s }} que {{ plural_quedan }} detenid{{ plural_os_as }} por orden de la Fiscalía General de la Republica, {{ texto_delitos_identificacion }} en perjuicio de {{ bloque_victimas_remision }}.</w:t>
       </w:r>
       <w:r>
         <w:rPr>
@@ -817,127 +246,7 @@
           <w:sz w:val="24"/>
           <w:lang w:val="es-SV"/>
         </w:rPr>
-        <w:t xml:space="preserve">Que </w:t>
-      </w:r>
-      <w:proofErr w:type="gramStart"/>
-      <w:r>
-        <w:rPr>
-          <w:rFonts w:ascii="Arial" w:hAnsi="Arial"/>
-          <w:b/>
-          <w:sz w:val="24"/>
-          <w:lang w:val="es-SV"/>
-        </w:rPr>
-        <w:t xml:space="preserve">puede{{ </w:t>
-      </w:r>
-      <w:proofErr w:type="spellStart"/>
-      <w:r>
-        <w:rPr>
-          <w:rFonts w:ascii="Arial" w:hAnsi="Arial"/>
-          <w:b/>
-          <w:sz w:val="24"/>
-          <w:lang w:val="es-SV"/>
-        </w:rPr>
-        <w:t>n</w:t>
-      </w:r>
-      <w:proofErr w:type="gramEnd"/>
-      <w:r>
-        <w:rPr>
-          <w:rFonts w:ascii="Arial" w:hAnsi="Arial"/>
-          <w:b/>
-          <w:sz w:val="24"/>
-          <w:lang w:val="es-SV"/>
-        </w:rPr>
-        <w:t>_</w:t>
-      </w:r>
-      <w:proofErr w:type="gramStart"/>
-      <w:r>
-        <w:rPr>
-          <w:rFonts w:ascii="Arial" w:hAnsi="Arial"/>
-          <w:b/>
-          <w:sz w:val="24"/>
-          <w:lang w:val="es-SV"/>
-        </w:rPr>
-        <w:t>plural</w:t>
-      </w:r>
-      <w:proofErr w:type="spellEnd"/>
-      <w:r>
-        <w:rPr>
-          <w:rFonts w:ascii="Arial" w:hAnsi="Arial"/>
-          <w:b/>
-          <w:sz w:val="24"/>
-          <w:lang w:val="es-SV"/>
-        </w:rPr>
-        <w:t xml:space="preserve"> }</w:t>
-      </w:r>
-      <w:proofErr w:type="gramEnd"/>
-      <w:r>
-        <w:rPr>
-          <w:rFonts w:ascii="Arial" w:hAnsi="Arial"/>
-          <w:b/>
-          <w:sz w:val="24"/>
-          <w:lang w:val="es-SV"/>
-        </w:rPr>
-        <w:t xml:space="preserve">} informar de su detención a una persona que </w:t>
-      </w:r>
-      <w:proofErr w:type="gramStart"/>
-      <w:r>
-        <w:rPr>
-          <w:rFonts w:ascii="Arial" w:hAnsi="Arial"/>
-          <w:b/>
-          <w:sz w:val="24"/>
-          <w:lang w:val="es-SV"/>
-        </w:rPr>
-        <w:t xml:space="preserve">elija{{ </w:t>
-      </w:r>
-      <w:proofErr w:type="spellStart"/>
-      <w:r>
-        <w:rPr>
-          <w:rFonts w:ascii="Arial" w:hAnsi="Arial"/>
-          <w:b/>
-          <w:sz w:val="24"/>
-          <w:lang w:val="es-SV"/>
-        </w:rPr>
-        <w:t>n</w:t>
-      </w:r>
-      <w:proofErr w:type="gramEnd"/>
-      <w:r>
-        <w:rPr>
-          <w:rFonts w:ascii="Arial" w:hAnsi="Arial"/>
-          <w:b/>
-          <w:sz w:val="24"/>
-          <w:lang w:val="es-SV"/>
-        </w:rPr>
-        <w:t>_</w:t>
-      </w:r>
-      <w:proofErr w:type="gramStart"/>
-      <w:r>
-        <w:rPr>
-          <w:rFonts w:ascii="Arial" w:hAnsi="Arial"/>
-          <w:b/>
-          <w:sz w:val="24"/>
-          <w:lang w:val="es-SV"/>
-        </w:rPr>
-        <w:t>plural</w:t>
-      </w:r>
-      <w:proofErr w:type="spellEnd"/>
-      <w:r>
-        <w:rPr>
-          <w:rFonts w:ascii="Arial" w:hAnsi="Arial"/>
-          <w:b/>
-          <w:sz w:val="24"/>
-          <w:lang w:val="es-SV"/>
-        </w:rPr>
-        <w:t xml:space="preserve"> }</w:t>
-      </w:r>
-      <w:proofErr w:type="gramEnd"/>
-      <w:r>
-        <w:rPr>
-          <w:rFonts w:ascii="Arial" w:hAnsi="Arial"/>
-          <w:b/>
-          <w:sz w:val="24"/>
-          <w:lang w:val="es-SV"/>
-        </w:rPr>
-        <w:t>},</w:t>
+        <w:t>Que puede{{ n_plural }} informar de su detención a una persona que elija{{ n_plural }},</w:t>
       </w:r>
       <w:r>
         <w:rPr>
@@ -948,7 +257,6 @@
         </w:rPr>
         <w:t xml:space="preserve"> </w:t>
       </w:r>
-      <w:proofErr w:type="gramStart"/>
       <w:r>
         <w:rPr>
           <w:rFonts w:ascii="Arial" w:hAnsi="Arial"/>
@@ -956,57 +264,7 @@
           <w:sz w:val="24"/>
           <w:lang w:val="es-SV"/>
         </w:rPr>
-        <w:t xml:space="preserve">{{ </w:t>
-      </w:r>
-      <w:proofErr w:type="spellStart"/>
-      <w:r>
-        <w:rPr>
-          <w:rFonts w:ascii="Arial" w:hAnsi="Arial"/>
-          <w:b/>
-          <w:sz w:val="24"/>
-          <w:lang w:val="es-SV"/>
-        </w:rPr>
-        <w:t>bloque</w:t>
-      </w:r>
-      <w:proofErr w:type="gramEnd"/>
-      <w:r>
-        <w:rPr>
-          <w:rFonts w:ascii="Arial" w:hAnsi="Arial"/>
-          <w:b/>
-          <w:sz w:val="24"/>
-          <w:lang w:val="es-SV"/>
-        </w:rPr>
-        <w:t>_avisos_</w:t>
-      </w:r>
-      <w:proofErr w:type="gramStart"/>
-      <w:r>
-        <w:rPr>
-          <w:rFonts w:ascii="Arial" w:hAnsi="Arial"/>
-          <w:b/>
-          <w:sz w:val="24"/>
-          <w:lang w:val="es-SV"/>
-        </w:rPr>
-        <w:t>identificacion</w:t>
-      </w:r>
-      <w:proofErr w:type="spellEnd"/>
-      <w:r>
-        <w:rPr>
-          <w:rFonts w:ascii="Arial" w:hAnsi="Arial"/>
-          <w:b/>
-          <w:sz w:val="24"/>
-          <w:lang w:val="es-SV"/>
-        </w:rPr>
-        <w:t xml:space="preserve"> }</w:t>
-      </w:r>
-      <w:proofErr w:type="gramEnd"/>
-      <w:r>
-        <w:rPr>
-          <w:rFonts w:ascii="Arial" w:hAnsi="Arial"/>
-          <w:b/>
-          <w:sz w:val="24"/>
-          <w:lang w:val="es-SV"/>
-        </w:rPr>
-        <w:t>}</w:t>
+        <w:t>{{ bloque_avisos_identificacion }}</w:t>
       </w:r>
       <w:r>
         <w:rPr>
@@ -1017,7 +275,6 @@
         </w:rPr>
         <w:t xml:space="preserve"> </w:t>
       </w:r>
-      <w:proofErr w:type="gramStart"/>
       <w:r>
         <w:rPr>
           <w:rFonts w:ascii="Arial" w:hAnsi="Arial"/>
@@ -1025,297 +282,7 @@
           <w:sz w:val="24"/>
           <w:lang w:val="es-SV"/>
         </w:rPr>
-        <w:t xml:space="preserve">Quien{{ </w:t>
-      </w:r>
-      <w:proofErr w:type="spellStart"/>
-      <w:r>
-        <w:rPr>
-          <w:rFonts w:ascii="Arial" w:hAnsi="Arial"/>
-          <w:b/>
-          <w:sz w:val="24"/>
-          <w:lang w:val="es-SV"/>
-        </w:rPr>
-        <w:t>es</w:t>
-      </w:r>
-      <w:proofErr w:type="gramEnd"/>
-      <w:r>
-        <w:rPr>
-          <w:rFonts w:ascii="Arial" w:hAnsi="Arial"/>
-          <w:b/>
-          <w:sz w:val="24"/>
-          <w:lang w:val="es-SV"/>
-        </w:rPr>
-        <w:t>_</w:t>
-      </w:r>
-      <w:proofErr w:type="gramStart"/>
-      <w:r>
-        <w:rPr>
-          <w:rFonts w:ascii="Arial" w:hAnsi="Arial"/>
-          <w:b/>
-          <w:sz w:val="24"/>
-          <w:lang w:val="es-SV"/>
-        </w:rPr>
-        <w:t>plural</w:t>
-      </w:r>
-      <w:proofErr w:type="spellEnd"/>
-      <w:r>
-        <w:rPr>
-          <w:rFonts w:ascii="Arial" w:hAnsi="Arial"/>
-          <w:b/>
-          <w:sz w:val="24"/>
-          <w:lang w:val="es-SV"/>
-        </w:rPr>
-        <w:t xml:space="preserve"> }</w:t>
-      </w:r>
-      <w:proofErr w:type="gramEnd"/>
-      <w:r>
-        <w:rPr>
-          <w:rFonts w:ascii="Arial" w:hAnsi="Arial"/>
-          <w:b/>
-          <w:sz w:val="24"/>
-          <w:lang w:val="es-SV"/>
-        </w:rPr>
-        <w:t xml:space="preserve">} </w:t>
-      </w:r>
-      <w:proofErr w:type="gramStart"/>
-      <w:r>
-        <w:rPr>
-          <w:rFonts w:ascii="Arial" w:hAnsi="Arial"/>
-          <w:b/>
-          <w:sz w:val="24"/>
-          <w:lang w:val="es-SV"/>
-        </w:rPr>
-        <w:t xml:space="preserve">tiene{{ </w:t>
-      </w:r>
-      <w:proofErr w:type="spellStart"/>
-      <w:r>
-        <w:rPr>
-          <w:rFonts w:ascii="Arial" w:hAnsi="Arial"/>
-          <w:b/>
-          <w:sz w:val="24"/>
-          <w:lang w:val="es-SV"/>
-        </w:rPr>
-        <w:t>n</w:t>
-      </w:r>
-      <w:proofErr w:type="gramEnd"/>
-      <w:r>
-        <w:rPr>
-          <w:rFonts w:ascii="Arial" w:hAnsi="Arial"/>
-          <w:b/>
-          <w:sz w:val="24"/>
-          <w:lang w:val="es-SV"/>
-        </w:rPr>
-        <w:t>_</w:t>
-      </w:r>
-      <w:proofErr w:type="gramStart"/>
-      <w:r>
-        <w:rPr>
-          <w:rFonts w:ascii="Arial" w:hAnsi="Arial"/>
-          <w:b/>
-          <w:sz w:val="24"/>
-          <w:lang w:val="es-SV"/>
-        </w:rPr>
-        <w:t>plural</w:t>
-      </w:r>
-      <w:proofErr w:type="spellEnd"/>
-      <w:r>
-        <w:rPr>
-          <w:rFonts w:ascii="Arial" w:hAnsi="Arial"/>
-          <w:b/>
-          <w:sz w:val="24"/>
-          <w:lang w:val="es-SV"/>
-        </w:rPr>
-        <w:t xml:space="preserve"> }</w:t>
-      </w:r>
-      <w:proofErr w:type="gramEnd"/>
-      <w:r>
-        <w:rPr>
-          <w:rFonts w:ascii="Arial" w:hAnsi="Arial"/>
-          <w:b/>
-          <w:sz w:val="24"/>
-          <w:lang w:val="es-SV"/>
-        </w:rPr>
-        <w:t xml:space="preserve">} derecho a ser </w:t>
-      </w:r>
-      <w:proofErr w:type="gramStart"/>
-      <w:r>
-        <w:rPr>
-          <w:rFonts w:ascii="Arial" w:hAnsi="Arial"/>
-          <w:b/>
-          <w:sz w:val="24"/>
-          <w:lang w:val="es-SV"/>
-        </w:rPr>
-        <w:t xml:space="preserve">asistid{{ </w:t>
-      </w:r>
-      <w:proofErr w:type="spellStart"/>
-      <w:r>
-        <w:rPr>
-          <w:rFonts w:ascii="Arial" w:hAnsi="Arial"/>
-          <w:b/>
-          <w:sz w:val="24"/>
-          <w:lang w:val="es-SV"/>
-        </w:rPr>
-        <w:t>plural</w:t>
-      </w:r>
-      <w:proofErr w:type="gramEnd"/>
-      <w:r>
-        <w:rPr>
-          <w:rFonts w:ascii="Arial" w:hAnsi="Arial"/>
-          <w:b/>
-          <w:sz w:val="24"/>
-          <w:lang w:val="es-SV"/>
-        </w:rPr>
-        <w:t>_os_</w:t>
-      </w:r>
-      <w:proofErr w:type="gramStart"/>
-      <w:r>
-        <w:rPr>
-          <w:rFonts w:ascii="Arial" w:hAnsi="Arial"/>
-          <w:b/>
-          <w:sz w:val="24"/>
-          <w:lang w:val="es-SV"/>
-        </w:rPr>
-        <w:t>as</w:t>
-      </w:r>
-      <w:proofErr w:type="spellEnd"/>
-      <w:r>
-        <w:rPr>
-          <w:rFonts w:ascii="Arial" w:hAnsi="Arial"/>
-          <w:b/>
-          <w:sz w:val="24"/>
-          <w:lang w:val="es-SV"/>
-        </w:rPr>
-        <w:t xml:space="preserve"> }</w:t>
-      </w:r>
-      <w:proofErr w:type="gramEnd"/>
-      <w:r>
-        <w:rPr>
-          <w:rFonts w:ascii="Arial" w:hAnsi="Arial"/>
-          <w:b/>
-          <w:sz w:val="24"/>
-          <w:lang w:val="es-SV"/>
-        </w:rPr>
-        <w:t xml:space="preserve">} legalmente por un defensor de conformidad al artículo 107 y siguiente del código Pr. </w:t>
-      </w:r>
-      <w:proofErr w:type="spellStart"/>
-      <w:r>
-        <w:rPr>
-          <w:rFonts w:ascii="Arial" w:hAnsi="Arial"/>
-          <w:b/>
-          <w:sz w:val="24"/>
-          <w:lang w:val="es-SV"/>
-        </w:rPr>
-        <w:t>Pn</w:t>
-      </w:r>
-      <w:proofErr w:type="spellEnd"/>
-      <w:r>
-        <w:rPr>
-          <w:rFonts w:ascii="Arial" w:hAnsi="Arial"/>
-          <w:b/>
-          <w:sz w:val="24"/>
-          <w:lang w:val="es-SV"/>
-        </w:rPr>
-        <w:t xml:space="preserve">. Que será{{ </w:t>
-      </w:r>
-      <w:proofErr w:type="spellStart"/>
-      <w:r>
-        <w:rPr>
-          <w:rFonts w:ascii="Arial" w:hAnsi="Arial"/>
-          <w:b/>
-          <w:sz w:val="24"/>
-          <w:lang w:val="es-SV"/>
-        </w:rPr>
-        <w:t>n_plural</w:t>
-      </w:r>
-      <w:proofErr w:type="spellEnd"/>
-      <w:r>
-        <w:rPr>
-          <w:rFonts w:ascii="Arial" w:hAnsi="Arial"/>
-          <w:b/>
-          <w:sz w:val="24"/>
-          <w:lang w:val="es-SV"/>
-        </w:rPr>
-        <w:t xml:space="preserve"> }} llevad{{ </w:t>
-      </w:r>
-      <w:proofErr w:type="spellStart"/>
-      <w:r>
-        <w:rPr>
-          <w:rFonts w:ascii="Arial" w:hAnsi="Arial"/>
-          <w:b/>
-          <w:sz w:val="24"/>
-          <w:lang w:val="es-SV"/>
-        </w:rPr>
-        <w:t>plural_os_as</w:t>
-      </w:r>
-      <w:proofErr w:type="spellEnd"/>
-      <w:r>
-        <w:rPr>
-          <w:rFonts w:ascii="Arial" w:hAnsi="Arial"/>
-          <w:b/>
-          <w:sz w:val="24"/>
-          <w:lang w:val="es-SV"/>
-        </w:rPr>
-        <w:t xml:space="preserve"> }} dentro del plazo legal ante la autoridad judicial competente, que tiene{{ </w:t>
-      </w:r>
-      <w:proofErr w:type="spellStart"/>
-      <w:r>
-        <w:rPr>
-          <w:rFonts w:ascii="Arial" w:hAnsi="Arial"/>
-          <w:b/>
-          <w:sz w:val="24"/>
-          <w:lang w:val="es-SV"/>
-        </w:rPr>
-        <w:t>n_plural</w:t>
-      </w:r>
-      <w:proofErr w:type="spellEnd"/>
-      <w:r>
-        <w:rPr>
-          <w:rFonts w:ascii="Arial" w:hAnsi="Arial"/>
-          <w:b/>
-          <w:sz w:val="24"/>
-          <w:lang w:val="es-SV"/>
-        </w:rPr>
-        <w:t xml:space="preserve"> }} derecho a abstenerse a declarar, a que no se empleen contra su dignidad a no ser </w:t>
-      </w:r>
-      <w:proofErr w:type="spellStart"/>
-      <w:r>
-        <w:rPr>
-          <w:rFonts w:ascii="Arial" w:hAnsi="Arial"/>
-          <w:b/>
-          <w:sz w:val="24"/>
-          <w:lang w:val="es-SV"/>
-        </w:rPr>
-        <w:t>sometid</w:t>
-      </w:r>
-      <w:proofErr w:type="spellEnd"/>
-      <w:r>
-        <w:rPr>
-          <w:rFonts w:ascii="Arial" w:hAnsi="Arial"/>
-          <w:b/>
-          <w:sz w:val="24"/>
-          <w:lang w:val="es-SV"/>
-        </w:rPr>
-        <w:t xml:space="preserve">{{ </w:t>
-      </w:r>
-      <w:proofErr w:type="spellStart"/>
-      <w:r>
-        <w:rPr>
-          <w:rFonts w:ascii="Arial" w:hAnsi="Arial"/>
-          <w:b/>
-          <w:sz w:val="24"/>
-          <w:lang w:val="es-SV"/>
-        </w:rPr>
-        <w:t>plural_os_as</w:t>
-      </w:r>
-      <w:proofErr w:type="spellEnd"/>
-      <w:r>
-        <w:rPr>
-          <w:rFonts w:ascii="Arial" w:hAnsi="Arial"/>
-          <w:b/>
-          <w:sz w:val="24"/>
-          <w:lang w:val="es-SV"/>
-        </w:rPr>
-        <w:t xml:space="preserve"> }} a técnicas o medios que induzcan o alteren su libre voluntad, que no se empleen medios que impidan el movimiento indispensable de su persona en el lugar y durante la realización de un acto procesal determinado, todo a presencia del Licenciado</w:t>
+        <w:t>Quien{{ es_plural }} tiene{{ n_plural }} derecho a ser asistid{{ plural_os_as }} legalmente por un defensor de conformidad al artículo 107 y siguiente del código Pr. Pn. Que será{{ n_plural }} llevad{{ plural_os_as }} dentro del plazo legal ante la autoridad judicial competente, que tiene{{ n_plural }} derecho a abstenerse a declarar, a que no se empleen contra su dignidad a no ser sometid{{ plural_os_as }} a técnicas o medios que induzcan o alteren su libre voluntad, que no se empleen medios que impidan el movimiento indispensable de su persona en el lugar y durante la realización de un acto procesal determinado, todo a presencia del Licenciado</w:t>
       </w:r>
       <w:r>
         <w:rPr>
@@ -1434,298 +401,7 @@
           <w:sz w:val="24"/>
           <w:lang w:val="es-SV"/>
         </w:rPr>
-        <w:t xml:space="preserve">(Presentar credencial y adjuntar documentación a los </w:t>
-      </w:r>
-      <w:proofErr w:type="spellStart"/>
-      <w:r>
-        <w:rPr>
-          <w:rFonts w:ascii="Arial" w:hAnsi="Arial"/>
-          <w:b/>
-          <w:sz w:val="24"/>
-          <w:lang w:val="es-SV"/>
-        </w:rPr>
-        <w:t>diligenciadores</w:t>
-      </w:r>
-      <w:proofErr w:type="spellEnd"/>
-      <w:r>
-        <w:rPr>
-          <w:rFonts w:ascii="Arial" w:hAnsi="Arial"/>
-          <w:b/>
-          <w:sz w:val="24"/>
-          <w:lang w:val="es-SV"/>
-        </w:rPr>
-        <w:t xml:space="preserve">). A </w:t>
-      </w:r>
-      <w:proofErr w:type="gramStart"/>
-      <w:r>
-        <w:rPr>
-          <w:rFonts w:ascii="Arial" w:hAnsi="Arial"/>
-          <w:b/>
-          <w:sz w:val="24"/>
-          <w:lang w:val="es-SV"/>
-        </w:rPr>
-        <w:t xml:space="preserve">{{ </w:t>
-      </w:r>
-      <w:proofErr w:type="spellStart"/>
-      <w:r>
-        <w:rPr>
-          <w:rFonts w:ascii="Arial" w:hAnsi="Arial"/>
-          <w:b/>
-          <w:sz w:val="24"/>
-          <w:lang w:val="es-SV"/>
-        </w:rPr>
-        <w:t>quienes</w:t>
-      </w:r>
-      <w:proofErr w:type="gramEnd"/>
-      <w:r>
-        <w:rPr>
-          <w:rFonts w:ascii="Arial" w:hAnsi="Arial"/>
-          <w:b/>
-          <w:sz w:val="24"/>
-          <w:lang w:val="es-SV"/>
-        </w:rPr>
-        <w:t>_</w:t>
-      </w:r>
-      <w:proofErr w:type="gramStart"/>
-      <w:r>
-        <w:rPr>
-          <w:rFonts w:ascii="Arial" w:hAnsi="Arial"/>
-          <w:b/>
-          <w:sz w:val="24"/>
-          <w:lang w:val="es-SV"/>
-        </w:rPr>
-        <w:t>identificacion</w:t>
-      </w:r>
-      <w:proofErr w:type="spellEnd"/>
-      <w:r>
-        <w:rPr>
-          <w:rFonts w:ascii="Arial" w:hAnsi="Arial"/>
-          <w:b/>
-          <w:sz w:val="24"/>
-          <w:lang w:val="es-SV"/>
-        </w:rPr>
-        <w:t xml:space="preserve"> }</w:t>
-      </w:r>
-      <w:proofErr w:type="gramEnd"/>
-      <w:r>
-        <w:rPr>
-          <w:rFonts w:ascii="Arial" w:hAnsi="Arial"/>
-          <w:b/>
-          <w:sz w:val="24"/>
-          <w:lang w:val="es-SV"/>
-        </w:rPr>
-        <w:t xml:space="preserve">} en este acto se </w:t>
-      </w:r>
-      <w:proofErr w:type="gramStart"/>
-      <w:r>
-        <w:rPr>
-          <w:rFonts w:ascii="Arial" w:hAnsi="Arial"/>
-          <w:b/>
-          <w:sz w:val="24"/>
-          <w:lang w:val="es-SV"/>
-        </w:rPr>
-        <w:t xml:space="preserve">{{ </w:t>
-      </w:r>
-      <w:proofErr w:type="spellStart"/>
-      <w:r>
-        <w:rPr>
-          <w:rFonts w:ascii="Arial" w:hAnsi="Arial"/>
-          <w:b/>
-          <w:sz w:val="24"/>
-          <w:lang w:val="es-SV"/>
-        </w:rPr>
-        <w:t>plural</w:t>
-      </w:r>
-      <w:proofErr w:type="gramEnd"/>
-      <w:r>
-        <w:rPr>
-          <w:rFonts w:ascii="Arial" w:hAnsi="Arial"/>
-          <w:b/>
-          <w:sz w:val="24"/>
-          <w:lang w:val="es-SV"/>
-        </w:rPr>
-        <w:t>_</w:t>
-      </w:r>
-      <w:proofErr w:type="gramStart"/>
-      <w:r>
-        <w:rPr>
-          <w:rFonts w:ascii="Arial" w:hAnsi="Arial"/>
-          <w:b/>
-          <w:sz w:val="24"/>
-          <w:lang w:val="es-SV"/>
-        </w:rPr>
-        <w:t>les</w:t>
-      </w:r>
-      <w:proofErr w:type="spellEnd"/>
-      <w:r>
-        <w:rPr>
-          <w:rFonts w:ascii="Arial" w:hAnsi="Arial"/>
-          <w:b/>
-          <w:sz w:val="24"/>
-          <w:lang w:val="es-SV"/>
-        </w:rPr>
-        <w:t xml:space="preserve"> }</w:t>
-      </w:r>
-      <w:proofErr w:type="gramEnd"/>
-      <w:r>
-        <w:rPr>
-          <w:rFonts w:ascii="Arial" w:hAnsi="Arial"/>
-          <w:b/>
-          <w:sz w:val="24"/>
-          <w:lang w:val="es-SV"/>
-        </w:rPr>
-        <w:t xml:space="preserve">} </w:t>
-      </w:r>
-      <w:proofErr w:type="gramStart"/>
-      <w:r>
-        <w:rPr>
-          <w:rFonts w:ascii="Arial" w:hAnsi="Arial"/>
-          <w:b/>
-          <w:sz w:val="24"/>
-          <w:lang w:val="es-SV"/>
-        </w:rPr>
-        <w:t>nombra como</w:t>
-      </w:r>
-      <w:proofErr w:type="gramEnd"/>
-      <w:r>
-        <w:rPr>
-          <w:rFonts w:ascii="Arial" w:hAnsi="Arial"/>
-          <w:b/>
-          <w:sz w:val="24"/>
-          <w:lang w:val="es-SV"/>
-        </w:rPr>
-        <w:t xml:space="preserve"> defensor para que ejerza sus derechos de defensa técnica. Manifestando </w:t>
-      </w:r>
-      <w:proofErr w:type="gramStart"/>
-      <w:r>
-        <w:rPr>
-          <w:rFonts w:ascii="Arial" w:hAnsi="Arial"/>
-          <w:b/>
-          <w:sz w:val="24"/>
-          <w:lang w:val="es-SV"/>
-        </w:rPr>
-        <w:t xml:space="preserve">{{ </w:t>
-      </w:r>
-      <w:proofErr w:type="spellStart"/>
-      <w:r>
-        <w:rPr>
-          <w:rFonts w:ascii="Arial" w:hAnsi="Arial"/>
-          <w:b/>
-          <w:sz w:val="24"/>
-          <w:lang w:val="es-SV"/>
-        </w:rPr>
-        <w:t>los</w:t>
-      </w:r>
-      <w:proofErr w:type="gramEnd"/>
-      <w:r>
-        <w:rPr>
-          <w:rFonts w:ascii="Arial" w:hAnsi="Arial"/>
-          <w:b/>
-          <w:sz w:val="24"/>
-          <w:lang w:val="es-SV"/>
-        </w:rPr>
-        <w:t>_imputados_</w:t>
-      </w:r>
-      <w:proofErr w:type="gramStart"/>
-      <w:r>
-        <w:rPr>
-          <w:rFonts w:ascii="Arial" w:hAnsi="Arial"/>
-          <w:b/>
-          <w:sz w:val="24"/>
-          <w:lang w:val="es-SV"/>
-        </w:rPr>
-        <w:t>texto</w:t>
-      </w:r>
-      <w:proofErr w:type="spellEnd"/>
-      <w:r>
-        <w:rPr>
-          <w:rFonts w:ascii="Arial" w:hAnsi="Arial"/>
-          <w:b/>
-          <w:sz w:val="24"/>
-          <w:lang w:val="es-SV"/>
-        </w:rPr>
-        <w:t xml:space="preserve"> }</w:t>
-      </w:r>
-      <w:proofErr w:type="gramEnd"/>
-      <w:r>
-        <w:rPr>
-          <w:rFonts w:ascii="Arial" w:hAnsi="Arial"/>
-          <w:b/>
-          <w:sz w:val="24"/>
-          <w:lang w:val="es-SV"/>
-        </w:rPr>
-        <w:t xml:space="preserve">} quedar </w:t>
-      </w:r>
-      <w:proofErr w:type="spellStart"/>
-      <w:proofErr w:type="gramStart"/>
-      <w:r>
-        <w:rPr>
-          <w:rFonts w:ascii="Arial" w:hAnsi="Arial"/>
-          <w:b/>
-          <w:sz w:val="24"/>
-          <w:lang w:val="es-SV"/>
-        </w:rPr>
-        <w:t>entendid</w:t>
-      </w:r>
-      <w:proofErr w:type="spellEnd"/>
-      <w:r>
-        <w:rPr>
-          <w:rFonts w:ascii="Arial" w:hAnsi="Arial"/>
-          <w:b/>
-          <w:sz w:val="24"/>
-          <w:lang w:val="es-SV"/>
-        </w:rPr>
-        <w:t xml:space="preserve">{{ </w:t>
-      </w:r>
-      <w:proofErr w:type="spellStart"/>
-      <w:r>
-        <w:rPr>
-          <w:rFonts w:ascii="Arial" w:hAnsi="Arial"/>
-          <w:b/>
-          <w:sz w:val="24"/>
-          <w:lang w:val="es-SV"/>
-        </w:rPr>
-        <w:t>plural</w:t>
-      </w:r>
-      <w:proofErr w:type="gramEnd"/>
-      <w:r>
-        <w:rPr>
-          <w:rFonts w:ascii="Arial" w:hAnsi="Arial"/>
-          <w:b/>
-          <w:sz w:val="24"/>
-          <w:lang w:val="es-SV"/>
-        </w:rPr>
-        <w:t>_os_</w:t>
-      </w:r>
-      <w:proofErr w:type="gramStart"/>
-      <w:r>
-        <w:rPr>
-          <w:rFonts w:ascii="Arial" w:hAnsi="Arial"/>
-          <w:b/>
-          <w:sz w:val="24"/>
-          <w:lang w:val="es-SV"/>
-        </w:rPr>
-        <w:t>as</w:t>
-      </w:r>
-      <w:proofErr w:type="spellEnd"/>
-      <w:r>
-        <w:rPr>
-          <w:rFonts w:ascii="Arial" w:hAnsi="Arial"/>
-          <w:b/>
-          <w:sz w:val="24"/>
-          <w:lang w:val="es-SV"/>
-        </w:rPr>
-        <w:t xml:space="preserve"> }</w:t>
-      </w:r>
-      <w:proofErr w:type="gramEnd"/>
-      <w:r>
-        <w:rPr>
-          <w:rFonts w:ascii="Arial" w:hAnsi="Arial"/>
-          <w:b/>
-          <w:sz w:val="24"/>
-          <w:lang w:val="es-SV"/>
-        </w:rPr>
-        <w:t>} de sus derechos y en su voluntad de ABSTENERSE A DECLARAR, en esta Unidad Policial. Por ser su derecho y leída que fue al compareciente el contenido de la presente acta la ratificamos y para constancia firmamos.</w:t>
+        <w:t>(Presentar credencial y adjuntar documentación a los diligenciadores). A {{ quienes_identificacion }} en este acto se {{ plural_les }} nombra como defensor para que ejerza sus derechos de defensa técnica. Manifestando {{ los_imputados_texto }} quedar entendid{{ plural_os_as }} de sus derechos y en su voluntad de ABSTENERSE A DECLARAR, en esta Unidad Policial. Por ser su derecho y leída que fue al compareciente el contenido de la presente acta la ratificamos y para constancia firmamos.</w:t>
       </w:r>
     </w:p>
     <w:p>
@@ -1812,7 +488,6 @@
           <w:lang w:val="es-SV"/>
         </w:rPr>
       </w:pPr>
-      <w:proofErr w:type="gramStart"/>
       <w:r>
         <w:rPr>
           <w:rFonts w:ascii="Arial" w:hAnsi="Arial"/>
@@ -1820,77 +495,7 @@
           <w:sz w:val="24"/>
           <w:lang w:val="es-SV"/>
         </w:rPr>
-        <w:t>{{ imp</w:t>
-      </w:r>
-      <w:proofErr w:type="gramEnd"/>
-      <w:r>
-        <w:rPr>
-          <w:rFonts w:ascii="Arial" w:hAnsi="Arial"/>
-          <w:b/>
-          <w:sz w:val="24"/>
-          <w:lang w:val="es-SV"/>
-        </w:rPr>
-        <w:t>.</w:t>
-      </w:r>
-      <w:proofErr w:type="gramStart"/>
-      <w:r>
-        <w:rPr>
-          <w:rFonts w:ascii="Arial" w:hAnsi="Arial"/>
-          <w:b/>
-          <w:sz w:val="24"/>
-          <w:lang w:val="es-SV"/>
-        </w:rPr>
-        <w:t>Nombre }</w:t>
-      </w:r>
-      <w:proofErr w:type="gramEnd"/>
-      <w:r>
-        <w:rPr>
-          <w:rFonts w:ascii="Arial" w:hAnsi="Arial"/>
-          <w:b/>
-          <w:sz w:val="24"/>
-          <w:lang w:val="es-SV"/>
-        </w:rPr>
-        <w:t>} (</w:t>
-      </w:r>
-      <w:proofErr w:type="gramStart"/>
-      <w:r>
-        <w:rPr>
-          <w:rFonts w:ascii="Arial" w:hAnsi="Arial"/>
-          <w:b/>
-          <w:sz w:val="24"/>
-          <w:lang w:val="es-SV"/>
-        </w:rPr>
-        <w:t>IMPUTAD{{ imp</w:t>
-      </w:r>
-      <w:proofErr w:type="gramEnd"/>
-      <w:r>
-        <w:rPr>
-          <w:rFonts w:ascii="Arial" w:hAnsi="Arial"/>
-          <w:b/>
-          <w:sz w:val="24"/>
-          <w:lang w:val="es-SV"/>
-        </w:rPr>
-        <w:t>.letra_o_</w:t>
-      </w:r>
-      <w:proofErr w:type="gramStart"/>
-      <w:r>
-        <w:rPr>
-          <w:rFonts w:ascii="Arial" w:hAnsi="Arial"/>
-          <w:b/>
-          <w:sz w:val="24"/>
-          <w:lang w:val="es-SV"/>
-        </w:rPr>
-        <w:t>a }</w:t>
-      </w:r>
-      <w:proofErr w:type="gramEnd"/>
-      <w:r>
-        <w:rPr>
-          <w:rFonts w:ascii="Arial" w:hAnsi="Arial"/>
-          <w:b/>
-          <w:sz w:val="24"/>
-          <w:lang w:val="es-SV"/>
-        </w:rPr>
-        <w:t>})</w:t>
+        <w:t>{{ imp.Nombre }} (IMPUTAD{{ imp.letra_o_a }})</w:t>
       </w:r>
     </w:p>
     <w:p>
@@ -1908,25 +513,7 @@
           <w:b/>
           <w:sz w:val="24"/>
         </w:rPr>
-        <w:t xml:space="preserve">{% </w:t>
-      </w:r>
-      <w:proofErr w:type="spellStart"/>
-      <w:r>
-        <w:rPr>
-          <w:rFonts w:ascii="Arial" w:hAnsi="Arial"/>
-          <w:b/>
-          <w:sz w:val="24"/>
-        </w:rPr>
-        <w:t>endfor</w:t>
-      </w:r>
-      <w:proofErr w:type="spellEnd"/>
-      <w:r>
-        <w:rPr>
-          <w:rFonts w:ascii="Arial" w:hAnsi="Arial"/>
-          <w:b/>
-          <w:sz w:val="24"/>
-        </w:rPr>
-        <w:t xml:space="preserve"> %}</w:t>
+        <w:t>{% endfor %}</w:t>
       </w:r>
     </w:p>
     <w:p>
@@ -1974,25 +561,7 @@
           <w:b/>
           <w:sz w:val="24"/>
         </w:rPr>
-        <w:t xml:space="preserve">F______________________          </w:t>
-      </w:r>
-      <w:proofErr w:type="spellStart"/>
-      <w:r>
-        <w:rPr>
-          <w:rFonts w:ascii="Arial" w:hAnsi="Arial"/>
-          <w:b/>
-          <w:sz w:val="24"/>
-        </w:rPr>
-        <w:t>F</w:t>
-      </w:r>
-      <w:proofErr w:type="spellEnd"/>
-      <w:r>
-        <w:rPr>
-          <w:rFonts w:ascii="Arial" w:hAnsi="Arial"/>
-          <w:b/>
-          <w:sz w:val="24"/>
-        </w:rPr>
-        <w:t>______________________</w:t>
+        <w:t>F______________________          F______________________</w:t>
       </w:r>
     </w:p>
     <w:p>

</xml_diff>